<commit_message>
update(localization):  update l10n_do_accounitng and documentation
</commit_message>
<xml_diff>
--- a/doc/doc_tecnico_l10n_do_accounting.docx
+++ b/doc/doc_tecnico_l10n_do_accounting.docx
@@ -1290,6 +1290,14 @@
     </w:p>
     <w:p>
       <w:pPr>
+        <w:pStyle w:val="ListBullet"/>
+      </w:pPr>
+      <w:r>
+        <w:t>Prevención de duplicados: constraint ORM que impide emitir el mismo NCF en dos facturas de venta activas de la misma compañía.</w:t>
+      </w:r>
+    </w:p>
+    <w:p>
+      <w:pPr>
         <w:pStyle w:val="Heading1"/>
         <w:jc w:val="left"/>
       </w:pPr>
@@ -1424,7 +1432,7 @@
         <w:br/>
         <w:t>│   ├── test_account_journal.py          Pruebas sobre el modelo account.journal</w:t>
         <w:br/>
-        <w:t>│   └── test_account_move.py             Pruebas sobre el modelo account.move (15 casos)</w:t>
+        <w:t>│   └── test_account_move.py             Pruebas sobre el modelo account.move (20 casos)</w:t>
         <w:br/>
         <w:t>│</w:t>
         <w:br/>
@@ -4289,6 +4297,38 @@
       <w:tr>
         <w:tc>
           <w:tcPr>
+            <w:tcW w:type="dxa" w:w="3041"/>
+          </w:tcPr>
+          <w:p>
+            <w:r>
+              <w:t>name</w:t>
+            </w:r>
+          </w:p>
+        </w:tc>
+        <w:tc>
+          <w:tcPr>
+            <w:tcW w:type="dxa" w:w="3041"/>
+          </w:tcPr>
+          <w:p>
+            <w:r>
+              <w:t>Char (computed, stored)</w:t>
+            </w:r>
+          </w:p>
+        </w:tc>
+        <w:tc>
+          <w:tcPr>
+            <w:tcW w:type="dxa" w:w="3041"/>
+          </w:tcPr>
+          <w:p>
+            <w:r>
+              <w:t>Nombre legible del lote en formato "INICIO → FIN" (ej: B0100000001 → B0100001000). Es el _rec_name del modelo, usado para mostrar el lote en campos Many2one.</w:t>
+            </w:r>
+          </w:p>
+        </w:tc>
+      </w:tr>
+      <w:tr>
+        <w:tc>
+          <w:tcPr>
             <w:tcW w:type="dxa" w:w="2835"/>
             <w:shd w:val="clear" w:color="auto" w:fill="EBF0F8"/>
           </w:tcPr>
@@ -4703,6 +4743,28 @@
       <w:tr>
         <w:tc>
           <w:tcPr>
+            <w:tcW w:type="dxa" w:w="4561"/>
+          </w:tcPr>
+          <w:p>
+            <w:r>
+              <w:t>_compute_name()</w:t>
+            </w:r>
+          </w:p>
+        </w:tc>
+        <w:tc>
+          <w:tcPr>
+            <w:tcW w:type="dxa" w:w="4561"/>
+          </w:tcPr>
+          <w:p>
+            <w:r>
+              <w:t>Calcula el campo name concatenando l10n_do_sequence_start y l10n_do_sequence_end con flecha (→). Depende de los mismos campos que _compute_parsed_numbers.</w:t>
+            </w:r>
+          </w:p>
+        </w:tc>
+      </w:tr>
+      <w:tr>
+        <w:tc>
+          <w:tcPr>
             <w:tcW w:type="dxa" w:w="3685"/>
             <w:shd w:val="clear" w:color="auto" w:fill="EBF0F8"/>
           </w:tcPr>
@@ -6086,8 +6148,42 @@
           </w:p>
         </w:tc>
       </w:tr>
+      <w:tr>
+        <w:tc>
+          <w:tcPr>
+            <w:tcW w:type="dxa" w:w="4561"/>
+          </w:tcPr>
+          <w:p>
+            <w:r>
+              <w:t>_l10n_do_check_unique_sale_ncf()</w:t>
+            </w:r>
+          </w:p>
+        </w:tc>
+        <w:tc>
+          <w:tcPr>
+            <w:tcW w:type="dxa" w:w="4561"/>
+          </w:tcPr>
+          <w:p>
+            <w:r>
+              <w:t>Constraint ORM. Verifica que no exista otra factura de venta activa (estado != cancel) en la misma compañía con el mismo l10n_do_fiscal_number. Aplica tanto a asignación automática (lote) como a ingreso manual. Lanza ValidationError con el NCF duplicado.</w:t>
+            </w:r>
+          </w:p>
+        </w:tc>
+      </w:tr>
     </w:tbl>
     <w:p/>
+    <w:p>
+      <w:pPr/>
+      <w:r>
+        <w:rPr>
+          <w:b/>
+        </w:rPr>
+        <w:t xml:space="preserve">NOTA — Compatibilidad Odoo 19: </w:t>
+      </w:r>
+      <w:r>
+        <w:t>En Odoo 19, el campo mobile fue eliminado de res.partner (solo existe phone). El template report_invoice.xml fue actualizado para remover todas las referencias a mobile. Adicionalmente, el acceso a doc_code_prefix[1:] fue corregido con (doc_code_prefix or '')[1:] para evitar TypeError cuando el campo es False.</w:t>
+      </w:r>
+    </w:p>
     <w:p>
       <w:pPr>
         <w:pStyle w:val="Heading2"/>
@@ -7752,6 +7848,14 @@
     </w:p>
     <w:p>
       <w:pPr>
+        <w:pStyle w:val="ListBullet"/>
+      </w:pPr>
+      <w:r>
+        <w:t>La constraint _l10n_do_check_unique_sale_ncf() garantiza unicidad de NCF en facturas de venta a nivel ORM, impidiendo duplicados tanto por asignación automática como por ingreso manual. Lanza ValidationError indicando el NCF en conflicto.</w:t>
+      </w:r>
+    </w:p>
+    <w:p>
+      <w:pPr>
         <w:pStyle w:val="Heading2"/>
         <w:jc w:val="left"/>
       </w:pPr>
@@ -8282,6 +8386,22 @@
     </w:p>
     <w:p>
       <w:pPr>
+        <w:pStyle w:val="ListBullet"/>
+      </w:pPr>
+      <w:r>
+        <w:t>El NCF de venta emitido por la compañía debe ser único por compañía (constraint _l10n_do_check_unique_sale_ncf). Cualquier intento de reutilizar un NCF ya asignado, ya sea manualmente o mediante auto-secuencia, lanza ValidationError.</w:t>
+      </w:r>
+    </w:p>
+    <w:p>
+      <w:pPr>
+        <w:pStyle w:val="ListBullet"/>
+      </w:pPr>
+      <w:r>
+        <w:t>El campo l10n_do_active_batch_id del modelo l10n_do.account.journal.document_type muestra el nombre legible del lote activo (INICIO → FIN) en la vista del diario, en lugar del identificador técnico interno.</w:t>
+      </w:r>
+    </w:p>
+    <w:p>
+      <w:pPr>
         <w:pStyle w:val="Heading1"/>
         <w:jc w:val="left"/>
       </w:pPr>
@@ -8615,6 +8735,48 @@
                 <w:sz w:val="18"/>
               </w:rPr>
               <w:t>Búsqueda optimizada de facturas por número de comprobante</w:t>
+            </w:r>
+          </w:p>
+        </w:tc>
+      </w:tr>
+      <w:tr>
+        <w:tc>
+          <w:tcPr>
+            <w:tcW w:type="dxa" w:w="2280"/>
+          </w:tcPr>
+          <w:p>
+            <w:r>
+              <w:t>account.move</w:t>
+            </w:r>
+          </w:p>
+        </w:tc>
+        <w:tc>
+          <w:tcPr>
+            <w:tcW w:type="dxa" w:w="2280"/>
+          </w:tcPr>
+          <w:p>
+            <w:r>
+              <w:t>l10n_do_fiscal_number + company_id (facturas de venta)</w:t>
+            </w:r>
+          </w:p>
+        </w:tc>
+        <w:tc>
+          <w:tcPr>
+            <w:tcW w:type="dxa" w:w="2280"/>
+          </w:tcPr>
+          <w:p>
+            <w:r>
+              <w:t>ORM Constraint</w:t>
+            </w:r>
+          </w:p>
+        </w:tc>
+        <w:tc>
+          <w:tcPr>
+            <w:tcW w:type="dxa" w:w="2280"/>
+          </w:tcPr>
+          <w:p>
+            <w:r>
+              <w:t>Constraint Python _l10n_do_check_unique_sale_ncf(): impide duplicados de NCF en facturas de venta activas. Complementa el índice DB con mensajes de error descriptivos en español.</w:t>
             </w:r>
           </w:p>
         </w:tc>
@@ -9638,6 +9800,166 @@
                 <w:sz w:val="18"/>
               </w:rPr>
               <w:t>Validación de monto mínimo.</w:t>
+            </w:r>
+          </w:p>
+        </w:tc>
+      </w:tr>
+      <w:tr>
+        <w:tc>
+          <w:tcPr>
+            <w:tcW w:type="dxa" w:w="3041"/>
+          </w:tcPr>
+          <w:p>
+            <w:r>
+              <w:t>test_016_duplicate_sale_ncf_blocked</w:t>
+            </w:r>
+          </w:p>
+        </w:tc>
+        <w:tc>
+          <w:tcPr>
+            <w:tcW w:type="dxa" w:w="3041"/>
+          </w:tcPr>
+          <w:p>
+            <w:r>
+              <w:t>Asignar manualmente un NCF ya registrado a una factura de venta genera ValidationError</w:t>
+            </w:r>
+          </w:p>
+        </w:tc>
+        <w:tc>
+          <w:tcPr>
+            <w:tcW w:type="dxa" w:w="3041"/>
+          </w:tcPr>
+          <w:p>
+            <w:r>
+              <w:t>Constraint _l10n_do_check_unique_sale_ncf activa al escribir l10n_do_fiscal_number duplicado. Error claro con NCF en conflicto.</w:t>
+            </w:r>
+          </w:p>
+        </w:tc>
+      </w:tr>
+      <w:tr>
+        <w:tc>
+          <w:tcPr>
+            <w:tcW w:type="dxa" w:w="3041"/>
+          </w:tcPr>
+          <w:p>
+            <w:r>
+              <w:t>test_017_auto_sequence_never_duplicates</w:t>
+            </w:r>
+          </w:p>
+        </w:tc>
+        <w:tc>
+          <w:tcPr>
+            <w:tcW w:type="dxa" w:w="3041"/>
+          </w:tcPr>
+          <w:p>
+            <w:r>
+              <w:t>La auto-secuencia nunca asigna el mismo NCF a dos facturas consecutivas</w:t>
+            </w:r>
+          </w:p>
+        </w:tc>
+        <w:tc>
+          <w:tcPr>
+            <w:tcW w:type="dxa" w:w="3041"/>
+          </w:tcPr>
+          <w:p>
+            <w:r>
+              <w:t>Tres facturas: B0100000001, B0100000002, B0100000003. Ningún NCF repetido. len(set(ncfs)) == 3.</w:t>
+            </w:r>
+          </w:p>
+        </w:tc>
+      </w:tr>
+      <w:tr>
+        <w:tc>
+          <w:tcPr>
+            <w:tcW w:type="dxa" w:w="3041"/>
+          </w:tcPr>
+          <w:p>
+            <w:r>
+              <w:t>test_018_ncf_batch_display_name</w:t>
+            </w:r>
+          </w:p>
+        </w:tc>
+        <w:tc>
+          <w:tcPr>
+            <w:tcW w:type="dxa" w:w="3041"/>
+          </w:tcPr>
+          <w:p>
+            <w:r>
+              <w:t>El campo name del lote contiene el rango legible INICIO → FIN</w:t>
+            </w:r>
+          </w:p>
+        </w:tc>
+        <w:tc>
+          <w:tcPr>
+            <w:tcW w:type="dxa" w:w="3041"/>
+          </w:tcPr>
+          <w:p>
+            <w:r>
+              <w:t>batch.name no vacío. Contiene l10n_do_sequence_start y l10n_do_sequence_end.</w:t>
+            </w:r>
+          </w:p>
+        </w:tc>
+      </w:tr>
+      <w:tr>
+        <w:tc>
+          <w:tcPr>
+            <w:tcW w:type="dxa" w:w="3041"/>
+          </w:tcPr>
+          <w:p>
+            <w:r>
+              <w:t>test_019_invoice_report_renders_without_error</w:t>
+            </w:r>
+          </w:p>
+        </w:tc>
+        <w:tc>
+          <w:tcPr>
+            <w:tcW w:type="dxa" w:w="3041"/>
+          </w:tcPr>
+          <w:p>
+            <w:r>
+              <w:t>Imprimir una factura fiscal confirmada no lanza ningún error de renderizado</w:t>
+            </w:r>
+          </w:p>
+        </w:tc>
+        <w:tc>
+          <w:tcPr>
+            <w:tcW w:type="dxa" w:w="3041"/>
+          </w:tcPr>
+          <w:p>
+            <w:r>
+              <w:t>ir.actions.report._render_qweb_html("account.report_invoice") retorna HTML no vacío sin excepciones.</w:t>
+            </w:r>
+          </w:p>
+        </w:tc>
+      </w:tr>
+      <w:tr>
+        <w:tc>
+          <w:tcPr>
+            <w:tcW w:type="dxa" w:w="3041"/>
+          </w:tcPr>
+          <w:p>
+            <w:r>
+              <w:t>test_020_invoice_report_partner_no_phone</w:t>
+            </w:r>
+          </w:p>
+        </w:tc>
+        <w:tc>
+          <w:tcPr>
+            <w:tcW w:type="dxa" w:w="3041"/>
+          </w:tcPr>
+          <w:p>
+            <w:r>
+              <w:t>El reporte de factura se renderiza correctamente cuando el socio no tiene teléfono</w:t>
+            </w:r>
+          </w:p>
+        </w:tc>
+        <w:tc>
+          <w:tcPr>
+            <w:tcW w:type="dxa" w:w="3041"/>
+          </w:tcPr>
+          <w:p>
+            <w:r>
+              <w:t>Compatibilidad Odoo 19: campo mobile eliminado de res.partner. Solo existe phone. El template no lanza AttributeError.</w:t>
             </w:r>
           </w:p>
         </w:tc>

</xml_diff>